<commit_message>
BLITS designerpakket: strategiegaten aangevuld in merkfundament en overdracht
Co-Authored-By: Claude Sonnet 5.5 <noreply@anthropic.com>
Claude-Session: https://claude.ai/code/session_01FsfihxDaAdpxXck1ER6Fgz
</commit_message>
<xml_diff>
--- a/now/briefs/designerpakket-2026-10-12/BLITS_01_Overdracht.docx
+++ b/now/briefs/designerpakket-2026-10-12/BLITS_01_Overdracht.docx
@@ -1575,6 +1575,40 @@
       </w:r>
       <w:r>
         <w:t xml:space="preserve">bij de bewonderde merken: spelling navragen.</w:t>
+      </w:r>
+    </w:p>
+    <w:p>
+      <w:pPr>
+        <w:numPr>
+          <w:ilvl w:val="0"/>
+          <w:numId w:val="1002"/>
+        </w:numPr>
+        <w:pStyle w:val="Compact"/>
+      </w:pPr>
+      <w:r>
+        <w:rPr>
+          <w:bCs/>
+          <w:b/>
+        </w:rPr>
+        <w:t xml:space="preserve">Visie en missie:</w:t>
+      </w:r>
+      <w:r>
+        <w:t xml:space="preserve"> </w:t>
+      </w:r>
+      <w:r>
+        <w:t xml:space="preserve">de teksten uit 2024 (</w:t>
+      </w:r>
+      <w:r>
+        <w:t xml:space="preserve">“</w:t>
+      </w:r>
+      <w:r>
+        <w:t xml:space="preserve">Wie is BLITS?</w:t>
+      </w:r>
+      <w:r>
+        <w:t xml:space="preserve">”</w:t>
+      </w:r>
+      <w:r>
+        <w:t xml:space="preserve">) zijn niet opnieuw bevestigd na de nieuwe reden van bestaan. Nog actueel, of vervangen?</w:t>
       </w:r>
     </w:p>
     <w:p>

</xml_diff>

<commit_message>
BLITS designerpakket en True Story Canvas bijgewerkt na PR 8 en Toppy-kennisbank
Co-Authored-By: Claude Sonnet 5.5 <noreply@anthropic.com>
Claude-Session: https://claude.ai/code/session_01FsfihxDaAdpxXck1ER6Fgz
</commit_message>
<xml_diff>
--- a/now/briefs/designerpakket-2026-10-12/BLITS_01_Overdracht.docx
+++ b/now/briefs/designerpakket-2026-10-12/BLITS_01_Overdracht.docx
@@ -83,7 +83,7 @@
         <w:t xml:space="preserve"> </w:t>
       </w:r>
       <w:r>
-        <w:t xml:space="preserve">12</w:t>
+        <w:t xml:space="preserve">14</w:t>
       </w:r>
       <w:r>
         <w:t xml:space="preserve"> </w:t>
@@ -482,13 +482,51 @@
           </w:p>
         </w:tc>
       </w:tr>
+      <w:tr>
+        <w:tc>
+          <w:tcPr/>
+          <w:p>
+            <w:pPr>
+              <w:pStyle w:val="Compact"/>
+              <w:jc w:val="left"/>
+            </w:pPr>
+            <w:r>
+              <w:t xml:space="preserve">8</w:t>
+            </w:r>
+          </w:p>
+        </w:tc>
+        <w:tc>
+          <w:tcPr/>
+          <w:p>
+            <w:pPr>
+              <w:pStyle w:val="Compact"/>
+              <w:jc w:val="left"/>
+            </w:pPr>
+            <w:r>
+              <w:t xml:space="preserve">True Story Canvas</w:t>
+            </w:r>
+          </w:p>
+        </w:tc>
+        <w:tc>
+          <w:tcPr/>
+          <w:p>
+            <w:pPr>
+              <w:pStyle w:val="Compact"/>
+              <w:jc w:val="left"/>
+            </w:pPr>
+            <w:r>
+              <w:t xml:space="preserve">Dertien onderdelen ingevuld voor BLITS, met een typbaar formulier</w:t>
+            </w:r>
+          </w:p>
+        </w:tc>
+      </w:tr>
     </w:tbl>
     <w:p>
       <w:pPr>
         <w:pStyle w:val="BodyText"/>
       </w:pPr>
       <w:r>
-        <w:t xml:space="preserve">Documenten 2 tot en met 5 zijn samengesteld uit de kennisbank en gelden per 12 oktober 2026.</w:t>
+        <w:t xml:space="preserve">Documenten 2 tot en met 5 zijn samengesteld uit de kennisbank. Documenten 1, 2 en 5 zijn bijgewerkt op 14 oktober 2026; documenten 3 en 4 zijn inhoudelijk ongewijzigd (stand 12 oktober). Document 8 staat in een typbaar formulier: https://claude.ai/artifact/G7hRy4krp2d7EVbe7eBQoM (privé: Bart moet het delen).</w:t>
       </w:r>
     </w:p>
     <w:bookmarkEnd w:id="21"/>
@@ -928,7 +966,33 @@
               <w:jc w:val="left"/>
             </w:pPr>
             <w:r>
-              <w:t xml:space="preserve">Voorstel op het nieuwe palet, niet visueel gecheckt</w:t>
+              <w:t xml:space="preserve">Bijgewerkt op het nieuwe palet (14 oktober), nog niet visueel gecheckt</w:t>
+            </w:r>
+          </w:p>
+        </w:tc>
+      </w:tr>
+      <w:tr>
+        <w:tc>
+          <w:tcPr/>
+          <w:p>
+            <w:pPr>
+              <w:pStyle w:val="Compact"/>
+              <w:jc w:val="left"/>
+            </w:pPr>
+            <w:r>
+              <w:t xml:space="preserve">True Story Canvas</w:t>
+            </w:r>
+          </w:p>
+        </w:tc>
+        <w:tc>
+          <w:tcPr/>
+          <w:p>
+            <w:pPr>
+              <w:pStyle w:val="Compact"/>
+              <w:jc w:val="left"/>
+            </w:pPr>
+            <w:r>
+              <w:t xml:space="preserve">Ingevuld (7 ingevuld, 5 voorstel, 1 open); kernwaarde en merkvisie nog niet vastgesteld</w:t>
             </w:r>
           </w:p>
         </w:tc>
@@ -1290,7 +1354,7 @@
         <w:pStyle w:val="Compact"/>
       </w:pPr>
       <w:r>
-        <w:t xml:space="preserve">De Nano Banana-prompts voor de sport-lijn (voetbaldoel, trampoline, rebounder).</w:t>
+        <w:t xml:space="preserve">Het visuele merkcanvas (Artifact) met de borden Overzicht, Kleur, Typografie en Logo.</w:t>
       </w:r>
     </w:p>
     <w:p>
@@ -1302,30 +1366,6 @@
         <w:pStyle w:val="Compact"/>
       </w:pPr>
       <w:r>
-        <w:t xml:space="preserve">Het eerdere verpakkingsvoorstel van 10 oktober.</w:t>
-      </w:r>
-    </w:p>
-    <w:p>
-      <w:pPr>
-        <w:numPr>
-          <w:ilvl w:val="0"/>
-          <w:numId w:val="1001"/>
-        </w:numPr>
-        <w:pStyle w:val="Compact"/>
-      </w:pPr>
-      <w:r>
-        <w:t xml:space="preserve">Het visuele merkcanvas (Artifact) met de borden Overzicht, Kleur, Typografie en Logo.</w:t>
-      </w:r>
-    </w:p>
-    <w:p>
-      <w:pPr>
-        <w:numPr>
-          <w:ilvl w:val="0"/>
-          <w:numId w:val="1001"/>
-        </w:numPr>
-        <w:pStyle w:val="Compact"/>
-      </w:pPr>
-      <w:r>
         <w:t xml:space="preserve">De websiteschets uit maart 2025 (bevat ook</w:t>
       </w:r>
       <w:r>
@@ -1367,7 +1407,7 @@
         <w:pStyle w:val="FirstParagraph"/>
       </w:pPr>
       <w:r>
-        <w:t xml:space="preserve">De documenten in dit pakket zijn bedoeld ter vervanging van de Word-merkgids.</w:t>
+        <w:t xml:space="preserve">De documenten in dit pakket zijn bedoeld ter vervanging van de Word-merkgids. De merkgids in de kennisbank zelf is op 14 oktober bijgewerkt (merkwaarden en persona’s terug, nieuw palet); de Nano Banana-prompts en het verpakkingsvoorstel staan inmiddels op het nieuwe palet.</w:t>
       </w:r>
     </w:p>
     <w:bookmarkEnd w:id="24"/>
@@ -1590,13 +1630,13 @@
           <w:bCs/>
           <w:b/>
         </w:rPr>
-        <w:t xml:space="preserve">Visie en missie:</w:t>
-      </w:r>
-      <w:r>
-        <w:t xml:space="preserve"> </w:t>
-      </w:r>
-      <w:r>
-        <w:t xml:space="preserve">de teksten uit 2024 (</w:t>
+        <w:t xml:space="preserve">Kernwaarde, merkvisie en merkmissie</w:t>
+      </w:r>
+      <w:r>
+        <w:t xml:space="preserve"> </w:t>
+      </w:r>
+      <w:r>
+        <w:t xml:space="preserve">(True Story Canvas): de kernwaarde (enkelvoud) is nog niet vastgesteld; voorstel Avontuur. De visie en missie uit 2024 (</w:t>
       </w:r>
       <w:r>
         <w:t xml:space="preserve">“</w:t>
@@ -1608,7 +1648,22 @@
         <w:t xml:space="preserve">”</w:t>
       </w:r>
       <w:r>
-        <w:t xml:space="preserve">) zijn niet opnieuw bevestigd na de nieuwe reden van bestaan. Nog actueel, of vervangen?</w:t>
+        <w:t xml:space="preserve">) zijn niet opnieuw bevestigd na de nieuwe reden van bestaan. Nog actueel, of vervangen? Let op: in de merkgids heten de vijf merkwaarden ook</w:t>
+      </w:r>
+      <w:r>
+        <w:t xml:space="preserve"> </w:t>
+      </w:r>
+      <w:r>
+        <w:t xml:space="preserve">“</w:t>
+      </w:r>
+      <w:r>
+        <w:t xml:space="preserve">kernwaarden</w:t>
+      </w:r>
+      <w:r>
+        <w:t xml:space="preserve">”</w:t>
+      </w:r>
+      <w:r>
+        <w:t xml:space="preserve">; dat is iets anders.</w:t>
       </w:r>
     </w:p>
     <w:p>
@@ -1902,7 +1957,69 @@
     </w:p>
     <w:bookmarkEnd w:id="27"/>
     <w:bookmarkEnd w:id="28"/>
-    <w:bookmarkStart w:id="29" w:name="wie-doet-wat"/>
+    <w:bookmarkStart w:id="29" w:name="context-vanuit-toppy"/>
+    <w:p>
+      <w:pPr>
+        <w:pStyle w:val="Heading1"/>
+      </w:pPr>
+      <w:r>
+        <w:t xml:space="preserve">Context vanuit Toppy</w:t>
+      </w:r>
+    </w:p>
+    <w:p>
+      <w:pPr>
+        <w:pStyle w:val="FirstParagraph"/>
+      </w:pPr>
+      <w:r>
+        <w:t xml:space="preserve">Uit de Toppy-kennisbank, voor wie het merk verder brengt:</w:t>
+      </w:r>
+    </w:p>
+    <w:p>
+      <w:pPr>
+        <w:numPr>
+          <w:ilvl w:val="0"/>
+          <w:numId w:val="1005"/>
+        </w:numPr>
+        <w:pStyle w:val="Compact"/>
+      </w:pPr>
+      <w:r>
+        <w:rPr>
+          <w:bCs/>
+          <w:b/>
+        </w:rPr>
+        <w:t xml:space="preserve">Eerste resellers.</w:t>
+      </w:r>
+      <w:r>
+        <w:t xml:space="preserve"> </w:t>
+      </w:r>
+      <w:r>
+        <w:t xml:space="preserve">Outdoorspeelgoed.nl is de eerste B2B-reseller van BLITS. Speelgoed de Betuwe kreeg BLITS geopend op het dealerportaal, met dezelfde voorwaarden als W’eau (LDD-groep). Het dealerkanaal is dus begonnen; het ontstaansverhaal uit dealerfrustratie hoort daar.</w:t>
+      </w:r>
+    </w:p>
+    <w:p>
+      <w:pPr>
+        <w:numPr>
+          <w:ilvl w:val="0"/>
+          <w:numId w:val="1005"/>
+        </w:numPr>
+        <w:pStyle w:val="Compact"/>
+      </w:pPr>
+      <w:r>
+        <w:rPr>
+          <w:bCs/>
+          <w:b/>
+        </w:rPr>
+        <w:t xml:space="preserve">Creator-programma (voorstel).</w:t>
+      </w:r>
+      <w:r>
+        <w:t xml:space="preserve"> </w:t>
+      </w:r>
+      <w:r>
+        <w:t xml:space="preserve">Er ligt een pitch voor een creator-, affiliate- en UGC-programma voor de eigen merken, BLITS inbegrepen, bij Tom en Sander. Nog geen besluit. Raakt de fotografie en de content die de designers maken.</w:t>
+      </w:r>
+    </w:p>
+    <w:bookmarkEnd w:id="29"/>
+    <w:bookmarkStart w:id="30" w:name="wie-doet-wat"/>
     <w:p>
       <w:pPr>
         <w:pStyle w:val="Heading1"/>
@@ -2027,8 +2144,8 @@
         </w:tc>
       </w:tr>
     </w:tbl>
-    <w:bookmarkEnd w:id="29"/>
-    <w:bookmarkStart w:id="30" w:name="waar-vind-je-meer"/>
+    <w:bookmarkEnd w:id="30"/>
+    <w:bookmarkStart w:id="31" w:name="waar-vind-je-meer"/>
     <w:p>
       <w:pPr>
         <w:pStyle w:val="Heading1"/>
@@ -2041,7 +2158,7 @@
       <w:pPr>
         <w:numPr>
           <w:ilvl w:val="0"/>
-          <w:numId w:val="1005"/>
+          <w:numId w:val="1006"/>
         </w:numPr>
         <w:pStyle w:val="Compact"/>
       </w:pPr>
@@ -2126,7 +2243,7 @@
       <w:pPr>
         <w:numPr>
           <w:ilvl w:val="0"/>
-          <w:numId w:val="1005"/>
+          <w:numId w:val="1006"/>
         </w:numPr>
         <w:pStyle w:val="Compact"/>
       </w:pPr>
@@ -2148,7 +2265,7 @@
       <w:pPr>
         <w:numPr>
           <w:ilvl w:val="0"/>
-          <w:numId w:val="1005"/>
+          <w:numId w:val="1006"/>
         </w:numPr>
         <w:pStyle w:val="Compact"/>
       </w:pPr>
@@ -2182,7 +2299,7 @@
       <w:pPr>
         <w:numPr>
           <w:ilvl w:val="0"/>
-          <w:numId w:val="1005"/>
+          <w:numId w:val="1006"/>
         </w:numPr>
         <w:pStyle w:val="Compact"/>
       </w:pPr>
@@ -2222,7 +2339,7 @@
       <w:pPr>
         <w:numPr>
           <w:ilvl w:val="0"/>
-          <w:numId w:val="1005"/>
+          <w:numId w:val="1006"/>
         </w:numPr>
         <w:pStyle w:val="Compact"/>
       </w:pPr>
@@ -2240,7 +2357,7 @@
         <w:t xml:space="preserve">(merkcanvas, storybook en beeldgenerator, met Woo als blauwdruk).</w:t>
       </w:r>
     </w:p>
-    <w:bookmarkEnd w:id="30"/>
+    <w:bookmarkEnd w:id="31"/>
     <w:sectPr/>
   </w:body>
 </w:document>
@@ -2578,6 +2695,9 @@
     <w:abstractNumId w:val="991"/>
   </w:num>
   <w:num w:numId="1005">
+    <w:abstractNumId w:val="991"/>
+  </w:num>
+  <w:num w:numId="1006">
     <w:abstractNumId w:val="991"/>
   </w:num>
 </w:numbering>

</xml_diff>